<commit_message>
Add verify task productivity auto-dispensed analysis, update reports and outputs
Made-with: Cursor
</commit_message>
<xml_diff>
--- a/verify task analysis/output/Dispense_Method_Analysis_Report.docx
+++ b/verify task analysis/output/Dispense_Method_Analysis_Report.docx
@@ -12,7 +12,7 @@
     </w:p>
     <w:p>
       <w:r>
-        <w:t>Generated: 2026-03-06 10:00</w:t>
+        <w:t>Generated: 2026-03-10 15:21</w:t>
       </w:r>
     </w:p>
     <w:p/>
@@ -3610,16 +3610,3245 @@
         <w:pStyle w:val="Heading1"/>
       </w:pPr>
       <w:r>
-        <w:t>4. Next Steps</w:t>
+        <w:t>4. Dispense Ratio Lookup (Apply to Forecast Volume)</w:t>
       </w:r>
     </w:p>
     <w:p>
       <w:r>
-        <w:t>• Use selected features for prediction model training (04_prediction_training_data.sql)</w:t>
+        <w:t>Historical ratios from prior 6 months. Use to allocate forecast volume across dispense methods. Level 1 = product_type × wh_name (preferred); fall back to level 2 (product_type), 3 (wh_name), or 4 (overall) if no match.</w:t>
+      </w:r>
+    </w:p>
+    <w:p>
+      <w:r>
+        <w:t>Formula: estimated_dispense_volume = forecast_volume × (pct_of_volume / 100)</w:t>
+      </w:r>
+    </w:p>
+    <w:tbl>
+      <w:tblPr>
+        <w:tblStyle w:val="TableGrid"/>
+        <w:tblW w:type="auto" w:w="0"/>
+        <w:tblLook w:firstColumn="1" w:firstRow="1" w:lastColumn="0" w:lastRow="0" w:noHBand="0" w:noVBand="1" w:val="04A0"/>
+      </w:tblPr>
+      <w:tblGrid>
+        <w:gridCol w:w="1234"/>
+        <w:gridCol w:w="1234"/>
+        <w:gridCol w:w="1234"/>
+        <w:gridCol w:w="1234"/>
+        <w:gridCol w:w="1234"/>
+        <w:gridCol w:w="1234"/>
+        <w:gridCol w:w="1234"/>
+      </w:tblGrid>
+      <w:tr>
+        <w:tc>
+          <w:tcPr>
+            <w:tcW w:type="dxa" w:w="1234"/>
+          </w:tcPr>
+          <w:p>
+            <w:r>
+              <w:rPr>
+                <w:b/>
+              </w:rPr>
+              <w:t>level</w:t>
+            </w:r>
+          </w:p>
+        </w:tc>
+        <w:tc>
+          <w:tcPr>
+            <w:tcW w:type="dxa" w:w="1234"/>
+          </w:tcPr>
+          <w:p>
+            <w:r>
+              <w:rPr>
+                <w:b/>
+              </w:rPr>
+              <w:t>product_type</w:t>
+            </w:r>
+          </w:p>
+        </w:tc>
+        <w:tc>
+          <w:tcPr>
+            <w:tcW w:type="dxa" w:w="1234"/>
+          </w:tcPr>
+          <w:p>
+            <w:r>
+              <w:rPr>
+                <w:b/>
+              </w:rPr>
+              <w:t>wh_name</w:t>
+            </w:r>
+          </w:p>
+        </w:tc>
+        <w:tc>
+          <w:tcPr>
+            <w:tcW w:type="dxa" w:w="1234"/>
+          </w:tcPr>
+          <w:p>
+            <w:r>
+              <w:rPr>
+                <w:b/>
+              </w:rPr>
+              <w:t>dispense_method</w:t>
+            </w:r>
+          </w:p>
+        </w:tc>
+        <w:tc>
+          <w:tcPr>
+            <w:tcW w:type="dxa" w:w="1234"/>
+          </w:tcPr>
+          <w:p>
+            <w:r>
+              <w:rPr>
+                <w:b/>
+              </w:rPr>
+              <w:t>pct_of_volume</w:t>
+            </w:r>
+          </w:p>
+        </w:tc>
+        <w:tc>
+          <w:tcPr>
+            <w:tcW w:type="dxa" w:w="1234"/>
+          </w:tcPr>
+          <w:p>
+            <w:r>
+              <w:rPr>
+                <w:b/>
+              </w:rPr>
+              <w:t>fill_count</w:t>
+            </w:r>
+          </w:p>
+        </w:tc>
+        <w:tc>
+          <w:tcPr>
+            <w:tcW w:type="dxa" w:w="1234"/>
+          </w:tcPr>
+          <w:p>
+            <w:r>
+              <w:rPr>
+                <w:b/>
+              </w:rPr>
+              <w:t>order_qty_sum</w:t>
+            </w:r>
+          </w:p>
+        </w:tc>
+      </w:tr>
+      <w:tr>
+        <w:tc>
+          <w:tcPr>
+            <w:tcW w:type="dxa" w:w="1234"/>
+          </w:tcPr>
+          <w:p>
+            <w:r>
+              <w:t>1</w:t>
+            </w:r>
+          </w:p>
+        </w:tc>
+        <w:tc>
+          <w:tcPr>
+            <w:tcW w:type="dxa" w:w="1234"/>
+          </w:tcPr>
+          <w:p>
+            <w:r>
+              <w:t>GLP</w:t>
+            </w:r>
+          </w:p>
+        </w:tc>
+        <w:tc>
+          <w:tcPr>
+            <w:tcW w:type="dxa" w:w="1234"/>
+          </w:tcPr>
+          <w:p>
+            <w:r>
+              <w:t>BEYONDRX_AZ</w:t>
+            </w:r>
+          </w:p>
+        </w:tc>
+        <w:tc>
+          <w:tcPr>
+            <w:tcW w:type="dxa" w:w="1234"/>
+          </w:tcPr>
+          <w:p>
+            <w:r>
+              <w:t>manual</w:t>
+            </w:r>
+          </w:p>
+        </w:tc>
+        <w:tc>
+          <w:tcPr>
+            <w:tcW w:type="dxa" w:w="1234"/>
+          </w:tcPr>
+          <w:p>
+            <w:r>
+              <w:t>100.0</w:t>
+            </w:r>
+          </w:p>
+        </w:tc>
+        <w:tc>
+          <w:tcPr>
+            <w:tcW w:type="dxa" w:w="1234"/>
+          </w:tcPr>
+          <w:p>
+            <w:r>
+              <w:t>140</w:t>
+            </w:r>
+          </w:p>
+        </w:tc>
+        <w:tc>
+          <w:tcPr>
+            <w:tcW w:type="dxa" w:w="1234"/>
+          </w:tcPr>
+          <w:p>
+            <w:r>
+              <w:t>1260</w:t>
+            </w:r>
+          </w:p>
+        </w:tc>
+      </w:tr>
+      <w:tr>
+        <w:tc>
+          <w:tcPr>
+            <w:tcW w:type="dxa" w:w="1234"/>
+          </w:tcPr>
+          <w:p>
+            <w:r>
+              <w:t>1</w:t>
+            </w:r>
+          </w:p>
+        </w:tc>
+        <w:tc>
+          <w:tcPr>
+            <w:tcW w:type="dxa" w:w="1234"/>
+          </w:tcPr>
+          <w:p>
+            <w:r>
+              <w:t>GLP</w:t>
+            </w:r>
+          </w:p>
+        </w:tc>
+        <w:tc>
+          <w:tcPr>
+            <w:tcW w:type="dxa" w:w="1234"/>
+          </w:tcPr>
+          <w:p>
+            <w:r>
+              <w:t>BEYONDRX_OH</w:t>
+            </w:r>
+          </w:p>
+        </w:tc>
+        <w:tc>
+          <w:tcPr>
+            <w:tcW w:type="dxa" w:w="1234"/>
+          </w:tcPr>
+          <w:p>
+            <w:r>
+              <w:t>manual</w:t>
+            </w:r>
+          </w:p>
+        </w:tc>
+        <w:tc>
+          <w:tcPr>
+            <w:tcW w:type="dxa" w:w="1234"/>
+          </w:tcPr>
+          <w:p>
+            <w:r>
+              <w:t>100.0</w:t>
+            </w:r>
+          </w:p>
+        </w:tc>
+        <w:tc>
+          <w:tcPr>
+            <w:tcW w:type="dxa" w:w="1234"/>
+          </w:tcPr>
+          <w:p>
+            <w:r>
+              <w:t>8965</w:t>
+            </w:r>
+          </w:p>
+        </w:tc>
+        <w:tc>
+          <w:tcPr>
+            <w:tcW w:type="dxa" w:w="1234"/>
+          </w:tcPr>
+          <w:p>
+            <w:r>
+              <w:t>74710</w:t>
+            </w:r>
+          </w:p>
+        </w:tc>
+      </w:tr>
+      <w:tr>
+        <w:tc>
+          <w:tcPr>
+            <w:tcW w:type="dxa" w:w="1234"/>
+          </w:tcPr>
+          <w:p>
+            <w:r>
+              <w:t>1</w:t>
+            </w:r>
+          </w:p>
+        </w:tc>
+        <w:tc>
+          <w:tcPr>
+            <w:tcW w:type="dxa" w:w="1234"/>
+          </w:tcPr>
+          <w:p>
+            <w:r>
+              <w:t>Gummy</w:t>
+            </w:r>
+          </w:p>
+        </w:tc>
+        <w:tc>
+          <w:tcPr>
+            <w:tcW w:type="dxa" w:w="1234"/>
+          </w:tcPr>
+          <w:p>
+            <w:r>
+              <w:t>BEYONDRX_OH</w:t>
+            </w:r>
+          </w:p>
+        </w:tc>
+        <w:tc>
+          <w:tcPr>
+            <w:tcW w:type="dxa" w:w="1234"/>
+          </w:tcPr>
+          <w:p>
+            <w:r>
+              <w:t>manual</w:t>
+            </w:r>
+          </w:p>
+        </w:tc>
+        <w:tc>
+          <w:tcPr>
+            <w:tcW w:type="dxa" w:w="1234"/>
+          </w:tcPr>
+          <w:p>
+            <w:r>
+              <w:t>100.0</w:t>
+            </w:r>
+          </w:p>
+        </w:tc>
+        <w:tc>
+          <w:tcPr>
+            <w:tcW w:type="dxa" w:w="1234"/>
+          </w:tcPr>
+          <w:p>
+            <w:r>
+              <w:t>9940</w:t>
+            </w:r>
+          </w:p>
+        </w:tc>
+        <w:tc>
+          <w:tcPr>
+            <w:tcW w:type="dxa" w:w="1234"/>
+          </w:tcPr>
+          <w:p>
+            <w:r>
+              <w:t>1398420</w:t>
+            </w:r>
+          </w:p>
+        </w:tc>
+      </w:tr>
+      <w:tr>
+        <w:tc>
+          <w:tcPr>
+            <w:tcW w:type="dxa" w:w="1234"/>
+          </w:tcPr>
+          <w:p>
+            <w:r>
+              <w:t>1</w:t>
+            </w:r>
+          </w:p>
+        </w:tc>
+        <w:tc>
+          <w:tcPr>
+            <w:tcW w:type="dxa" w:w="1234"/>
+          </w:tcPr>
+          <w:p>
+            <w:r>
+              <w:t>Meal Kit</w:t>
+            </w:r>
+          </w:p>
+        </w:tc>
+        <w:tc>
+          <w:tcPr>
+            <w:tcW w:type="dxa" w:w="1234"/>
+          </w:tcPr>
+          <w:p>
+            <w:r>
+              <w:t>OHIO</w:t>
+            </w:r>
+          </w:p>
+        </w:tc>
+        <w:tc>
+          <w:tcPr>
+            <w:tcW w:type="dxa" w:w="1234"/>
+          </w:tcPr>
+          <w:p>
+            <w:r>
+              <w:t>other</w:t>
+            </w:r>
+          </w:p>
+        </w:tc>
+        <w:tc>
+          <w:tcPr>
+            <w:tcW w:type="dxa" w:w="1234"/>
+          </w:tcPr>
+          <w:p>
+            <w:r>
+              <w:t>100.0</w:t>
+            </w:r>
+          </w:p>
+        </w:tc>
+        <w:tc>
+          <w:tcPr>
+            <w:tcW w:type="dxa" w:w="1234"/>
+          </w:tcPr>
+          <w:p>
+            <w:r>
+              <w:t>0</w:t>
+            </w:r>
+          </w:p>
+        </w:tc>
+        <w:tc>
+          <w:tcPr>
+            <w:tcW w:type="dxa" w:w="1234"/>
+          </w:tcPr>
+          <w:p>
+            <w:r>
+              <w:t>3159</w:t>
+            </w:r>
+          </w:p>
+        </w:tc>
+      </w:tr>
+      <w:tr>
+        <w:tc>
+          <w:tcPr>
+            <w:tcW w:type="dxa" w:w="1234"/>
+          </w:tcPr>
+          <w:p>
+            <w:r>
+              <w:t>1</w:t>
+            </w:r>
+          </w:p>
+        </w:tc>
+        <w:tc>
+          <w:tcPr>
+            <w:tcW w:type="dxa" w:w="1234"/>
+          </w:tcPr>
+          <w:p>
+            <w:r>
+              <w:t>Multis Orders</w:t>
+            </w:r>
+          </w:p>
+        </w:tc>
+        <w:tc>
+          <w:tcPr>
+            <w:tcW w:type="dxa" w:w="1234"/>
+          </w:tcPr>
+          <w:p>
+            <w:r>
+              <w:t>BEYONDRX_AZ</w:t>
+            </w:r>
+          </w:p>
+        </w:tc>
+        <w:tc>
+          <w:tcPr>
+            <w:tcW w:type="dxa" w:w="1234"/>
+          </w:tcPr>
+          <w:p>
+            <w:r>
+              <w:t>automated</w:t>
+            </w:r>
+          </w:p>
+        </w:tc>
+        <w:tc>
+          <w:tcPr>
+            <w:tcW w:type="dxa" w:w="1234"/>
+          </w:tcPr>
+          <w:p>
+            <w:r>
+              <w:t>34.9</w:t>
+            </w:r>
+          </w:p>
+        </w:tc>
+        <w:tc>
+          <w:tcPr>
+            <w:tcW w:type="dxa" w:w="1234"/>
+          </w:tcPr>
+          <w:p>
+            <w:r>
+              <w:t>10158</w:t>
+            </w:r>
+          </w:p>
+        </w:tc>
+        <w:tc>
+          <w:tcPr>
+            <w:tcW w:type="dxa" w:w="1234"/>
+          </w:tcPr>
+          <w:p>
+            <w:r>
+              <w:t>2825881</w:t>
+            </w:r>
+          </w:p>
+        </w:tc>
+      </w:tr>
+      <w:tr>
+        <w:tc>
+          <w:tcPr>
+            <w:tcW w:type="dxa" w:w="1234"/>
+          </w:tcPr>
+          <w:p>
+            <w:r>
+              <w:t>1</w:t>
+            </w:r>
+          </w:p>
+        </w:tc>
+        <w:tc>
+          <w:tcPr>
+            <w:tcW w:type="dxa" w:w="1234"/>
+          </w:tcPr>
+          <w:p>
+            <w:r>
+              <w:t>Multis Orders</w:t>
+            </w:r>
+          </w:p>
+        </w:tc>
+        <w:tc>
+          <w:tcPr>
+            <w:tcW w:type="dxa" w:w="1234"/>
+          </w:tcPr>
+          <w:p>
+            <w:r>
+              <w:t>BEYONDRX_AZ</w:t>
+            </w:r>
+          </w:p>
+        </w:tc>
+        <w:tc>
+          <w:tcPr>
+            <w:tcW w:type="dxa" w:w="1234"/>
+          </w:tcPr>
+          <w:p>
+            <w:r>
+              <w:t>manual</w:t>
+            </w:r>
+          </w:p>
+        </w:tc>
+        <w:tc>
+          <w:tcPr>
+            <w:tcW w:type="dxa" w:w="1234"/>
+          </w:tcPr>
+          <w:p>
+            <w:r>
+              <w:t>65.1</w:t>
+            </w:r>
+          </w:p>
+        </w:tc>
+        <w:tc>
+          <w:tcPr>
+            <w:tcW w:type="dxa" w:w="1234"/>
+          </w:tcPr>
+          <w:p>
+            <w:r>
+              <w:t>26980</w:t>
+            </w:r>
+          </w:p>
+        </w:tc>
+        <w:tc>
+          <w:tcPr>
+            <w:tcW w:type="dxa" w:w="1234"/>
+          </w:tcPr>
+          <w:p>
+            <w:r>
+              <w:t>5270500</w:t>
+            </w:r>
+          </w:p>
+        </w:tc>
+      </w:tr>
+      <w:tr>
+        <w:tc>
+          <w:tcPr>
+            <w:tcW w:type="dxa" w:w="1234"/>
+          </w:tcPr>
+          <w:p>
+            <w:r>
+              <w:t>1</w:t>
+            </w:r>
+          </w:p>
+        </w:tc>
+        <w:tc>
+          <w:tcPr>
+            <w:tcW w:type="dxa" w:w="1234"/>
+          </w:tcPr>
+          <w:p>
+            <w:r>
+              <w:t>Multis Orders</w:t>
+            </w:r>
+          </w:p>
+        </w:tc>
+        <w:tc>
+          <w:tcPr>
+            <w:tcW w:type="dxa" w:w="1234"/>
+          </w:tcPr>
+          <w:p>
+            <w:r>
+              <w:t>BEYONDRX_OH</w:t>
+            </w:r>
+          </w:p>
+        </w:tc>
+        <w:tc>
+          <w:tcPr>
+            <w:tcW w:type="dxa" w:w="1234"/>
+          </w:tcPr>
+          <w:p>
+            <w:r>
+              <w:t>automated</w:t>
+            </w:r>
+          </w:p>
+        </w:tc>
+        <w:tc>
+          <w:tcPr>
+            <w:tcW w:type="dxa" w:w="1234"/>
+          </w:tcPr>
+          <w:p>
+            <w:r>
+              <w:t>92.96</w:t>
+            </w:r>
+          </w:p>
+        </w:tc>
+        <w:tc>
+          <w:tcPr>
+            <w:tcW w:type="dxa" w:w="1234"/>
+          </w:tcPr>
+          <w:p>
+            <w:r>
+              <w:t>47971</w:t>
+            </w:r>
+          </w:p>
+        </w:tc>
+        <w:tc>
+          <w:tcPr>
+            <w:tcW w:type="dxa" w:w="1234"/>
+          </w:tcPr>
+          <w:p>
+            <w:r>
+              <w:t>11288716</w:t>
+            </w:r>
+          </w:p>
+        </w:tc>
+      </w:tr>
+      <w:tr>
+        <w:tc>
+          <w:tcPr>
+            <w:tcW w:type="dxa" w:w="1234"/>
+          </w:tcPr>
+          <w:p>
+            <w:r>
+              <w:t>1</w:t>
+            </w:r>
+          </w:p>
+        </w:tc>
+        <w:tc>
+          <w:tcPr>
+            <w:tcW w:type="dxa" w:w="1234"/>
+          </w:tcPr>
+          <w:p>
+            <w:r>
+              <w:t>Multis Orders</w:t>
+            </w:r>
+          </w:p>
+        </w:tc>
+        <w:tc>
+          <w:tcPr>
+            <w:tcW w:type="dxa" w:w="1234"/>
+          </w:tcPr>
+          <w:p>
+            <w:r>
+              <w:t>BEYONDRX_OH</w:t>
+            </w:r>
+          </w:p>
+        </w:tc>
+        <w:tc>
+          <w:tcPr>
+            <w:tcW w:type="dxa" w:w="1234"/>
+          </w:tcPr>
+          <w:p>
+            <w:r>
+              <w:t>manual</w:t>
+            </w:r>
+          </w:p>
+        </w:tc>
+        <w:tc>
+          <w:tcPr>
+            <w:tcW w:type="dxa" w:w="1234"/>
+          </w:tcPr>
+          <w:p>
+            <w:r>
+              <w:t>7.04</w:t>
+            </w:r>
+          </w:p>
+        </w:tc>
+        <w:tc>
+          <w:tcPr>
+            <w:tcW w:type="dxa" w:w="1234"/>
+          </w:tcPr>
+          <w:p>
+            <w:r>
+              <w:t>9020</w:t>
+            </w:r>
+          </w:p>
+        </w:tc>
+        <w:tc>
+          <w:tcPr>
+            <w:tcW w:type="dxa" w:w="1234"/>
+          </w:tcPr>
+          <w:p>
+            <w:r>
+              <w:t>855120</w:t>
+            </w:r>
+          </w:p>
+        </w:tc>
+      </w:tr>
+      <w:tr>
+        <w:tc>
+          <w:tcPr>
+            <w:tcW w:type="dxa" w:w="1234"/>
+          </w:tcPr>
+          <w:p>
+            <w:r>
+              <w:t>1</w:t>
+            </w:r>
+          </w:p>
+        </w:tc>
+        <w:tc>
+          <w:tcPr>
+            <w:tcW w:type="dxa" w:w="1234"/>
+          </w:tcPr>
+          <w:p>
+            <w:r>
+              <w:t>Non-Rx</w:t>
+            </w:r>
+          </w:p>
+        </w:tc>
+        <w:tc>
+          <w:tcPr>
+            <w:tcW w:type="dxa" w:w="1234"/>
+          </w:tcPr>
+          <w:p>
+            <w:r>
+              <w:t>OHIO</w:t>
+            </w:r>
+          </w:p>
+        </w:tc>
+        <w:tc>
+          <w:tcPr>
+            <w:tcW w:type="dxa" w:w="1234"/>
+          </w:tcPr>
+          <w:p>
+            <w:r>
+              <w:t>other</w:t>
+            </w:r>
+          </w:p>
+        </w:tc>
+        <w:tc>
+          <w:tcPr>
+            <w:tcW w:type="dxa" w:w="1234"/>
+          </w:tcPr>
+          <w:p>
+            <w:r>
+              <w:t>100.0</w:t>
+            </w:r>
+          </w:p>
+        </w:tc>
+        <w:tc>
+          <w:tcPr>
+            <w:tcW w:type="dxa" w:w="1234"/>
+          </w:tcPr>
+          <w:p>
+            <w:r>
+              <w:t>0</w:t>
+            </w:r>
+          </w:p>
+        </w:tc>
+        <w:tc>
+          <w:tcPr>
+            <w:tcW w:type="dxa" w:w="1234"/>
+          </w:tcPr>
+          <w:p>
+            <w:r>
+              <w:t>78717</w:t>
+            </w:r>
+          </w:p>
+        </w:tc>
+      </w:tr>
+      <w:tr>
+        <w:tc>
+          <w:tcPr>
+            <w:tcW w:type="dxa" w:w="1234"/>
+          </w:tcPr>
+          <w:p>
+            <w:r>
+              <w:t>1</w:t>
+            </w:r>
+          </w:p>
+        </w:tc>
+        <w:tc>
+          <w:tcPr>
+            <w:tcW w:type="dxa" w:w="1234"/>
+          </w:tcPr>
+          <w:p>
+            <w:r>
+              <w:t>Rx</w:t>
+            </w:r>
+          </w:p>
+        </w:tc>
+        <w:tc>
+          <w:tcPr>
+            <w:tcW w:type="dxa" w:w="1234"/>
+          </w:tcPr>
+          <w:p>
+            <w:r>
+              <w:t>BEYONDRX_AZ</w:t>
+            </w:r>
+          </w:p>
+        </w:tc>
+        <w:tc>
+          <w:tcPr>
+            <w:tcW w:type="dxa" w:w="1234"/>
+          </w:tcPr>
+          <w:p>
+            <w:r>
+              <w:t>automated</w:t>
+            </w:r>
+          </w:p>
+        </w:tc>
+        <w:tc>
+          <w:tcPr>
+            <w:tcW w:type="dxa" w:w="1234"/>
+          </w:tcPr>
+          <w:p>
+            <w:r>
+              <w:t>83.67</w:t>
+            </w:r>
+          </w:p>
+        </w:tc>
+        <w:tc>
+          <w:tcPr>
+            <w:tcW w:type="dxa" w:w="1234"/>
+          </w:tcPr>
+          <w:p>
+            <w:r>
+              <w:t>89350</w:t>
+            </w:r>
+          </w:p>
+        </w:tc>
+        <w:tc>
+          <w:tcPr>
+            <w:tcW w:type="dxa" w:w="1234"/>
+          </w:tcPr>
+          <w:p>
+            <w:r>
+              <w:t>5398634</w:t>
+            </w:r>
+          </w:p>
+        </w:tc>
+      </w:tr>
+      <w:tr>
+        <w:tc>
+          <w:tcPr>
+            <w:tcW w:type="dxa" w:w="1234"/>
+          </w:tcPr>
+          <w:p>
+            <w:r>
+              <w:t>1</w:t>
+            </w:r>
+          </w:p>
+        </w:tc>
+        <w:tc>
+          <w:tcPr>
+            <w:tcW w:type="dxa" w:w="1234"/>
+          </w:tcPr>
+          <w:p>
+            <w:r>
+              <w:t>Rx</w:t>
+            </w:r>
+          </w:p>
+        </w:tc>
+        <w:tc>
+          <w:tcPr>
+            <w:tcW w:type="dxa" w:w="1234"/>
+          </w:tcPr>
+          <w:p>
+            <w:r>
+              <w:t>BEYONDRX_AZ</w:t>
+            </w:r>
+          </w:p>
+        </w:tc>
+        <w:tc>
+          <w:tcPr>
+            <w:tcW w:type="dxa" w:w="1234"/>
+          </w:tcPr>
+          <w:p>
+            <w:r>
+              <w:t>manual</w:t>
+            </w:r>
+          </w:p>
+        </w:tc>
+        <w:tc>
+          <w:tcPr>
+            <w:tcW w:type="dxa" w:w="1234"/>
+          </w:tcPr>
+          <w:p>
+            <w:r>
+              <w:t>16.25</w:t>
+            </w:r>
+          </w:p>
+        </w:tc>
+        <w:tc>
+          <w:tcPr>
+            <w:tcW w:type="dxa" w:w="1234"/>
+          </w:tcPr>
+          <w:p>
+            <w:r>
+              <w:t>12228</w:t>
+            </w:r>
+          </w:p>
+        </w:tc>
+        <w:tc>
+          <w:tcPr>
+            <w:tcW w:type="dxa" w:w="1234"/>
+          </w:tcPr>
+          <w:p>
+            <w:r>
+              <w:t>1048625</w:t>
+            </w:r>
+          </w:p>
+        </w:tc>
+      </w:tr>
+      <w:tr>
+        <w:tc>
+          <w:tcPr>
+            <w:tcW w:type="dxa" w:w="1234"/>
+          </w:tcPr>
+          <w:p>
+            <w:r>
+              <w:t>1</w:t>
+            </w:r>
+          </w:p>
+        </w:tc>
+        <w:tc>
+          <w:tcPr>
+            <w:tcW w:type="dxa" w:w="1234"/>
+          </w:tcPr>
+          <w:p>
+            <w:r>
+              <w:t>Rx</w:t>
+            </w:r>
+          </w:p>
+        </w:tc>
+        <w:tc>
+          <w:tcPr>
+            <w:tcW w:type="dxa" w:w="1234"/>
+          </w:tcPr>
+          <w:p>
+            <w:r>
+              <w:t>BEYONDRX_AZ</w:t>
+            </w:r>
+          </w:p>
+        </w:tc>
+        <w:tc>
+          <w:tcPr>
+            <w:tcW w:type="dxa" w:w="1234"/>
+          </w:tcPr>
+          <w:p>
+            <w:r>
+              <w:t>other</w:t>
+            </w:r>
+          </w:p>
+        </w:tc>
+        <w:tc>
+          <w:tcPr>
+            <w:tcW w:type="dxa" w:w="1234"/>
+          </w:tcPr>
+          <w:p>
+            <w:r>
+              <w:t>0.08</w:t>
+            </w:r>
+          </w:p>
+        </w:tc>
+        <w:tc>
+          <w:tcPr>
+            <w:tcW w:type="dxa" w:w="1234"/>
+          </w:tcPr>
+          <w:p>
+            <w:r>
+              <w:t>0</w:t>
+            </w:r>
+          </w:p>
+        </w:tc>
+        <w:tc>
+          <w:tcPr>
+            <w:tcW w:type="dxa" w:w="1234"/>
+          </w:tcPr>
+          <w:p>
+            <w:r>
+              <w:t>5181</w:t>
+            </w:r>
+          </w:p>
+        </w:tc>
+      </w:tr>
+      <w:tr>
+        <w:tc>
+          <w:tcPr>
+            <w:tcW w:type="dxa" w:w="1234"/>
+          </w:tcPr>
+          <w:p>
+            <w:r>
+              <w:t>1</w:t>
+            </w:r>
+          </w:p>
+        </w:tc>
+        <w:tc>
+          <w:tcPr>
+            <w:tcW w:type="dxa" w:w="1234"/>
+          </w:tcPr>
+          <w:p>
+            <w:r>
+              <w:t>Rx</w:t>
+            </w:r>
+          </w:p>
+        </w:tc>
+        <w:tc>
+          <w:tcPr>
+            <w:tcW w:type="dxa" w:w="1234"/>
+          </w:tcPr>
+          <w:p>
+            <w:r>
+              <w:t>BEYONDRX_OH</w:t>
+            </w:r>
+          </w:p>
+        </w:tc>
+        <w:tc>
+          <w:tcPr>
+            <w:tcW w:type="dxa" w:w="1234"/>
+          </w:tcPr>
+          <w:p>
+            <w:r>
+              <w:t>automated</w:t>
+            </w:r>
+          </w:p>
+        </w:tc>
+        <w:tc>
+          <w:tcPr>
+            <w:tcW w:type="dxa" w:w="1234"/>
+          </w:tcPr>
+          <w:p>
+            <w:r>
+              <w:t>95.79</w:t>
+            </w:r>
+          </w:p>
+        </w:tc>
+        <w:tc>
+          <w:tcPr>
+            <w:tcW w:type="dxa" w:w="1234"/>
+          </w:tcPr>
+          <w:p>
+            <w:r>
+              <w:t>172277</w:t>
+            </w:r>
+          </w:p>
+        </w:tc>
+        <w:tc>
+          <w:tcPr>
+            <w:tcW w:type="dxa" w:w="1234"/>
+          </w:tcPr>
+          <w:p>
+            <w:r>
+              <w:t>11387828</w:t>
+            </w:r>
+          </w:p>
+        </w:tc>
+      </w:tr>
+      <w:tr>
+        <w:tc>
+          <w:tcPr>
+            <w:tcW w:type="dxa" w:w="1234"/>
+          </w:tcPr>
+          <w:p>
+            <w:r>
+              <w:t>1</w:t>
+            </w:r>
+          </w:p>
+        </w:tc>
+        <w:tc>
+          <w:tcPr>
+            <w:tcW w:type="dxa" w:w="1234"/>
+          </w:tcPr>
+          <w:p>
+            <w:r>
+              <w:t>Rx</w:t>
+            </w:r>
+          </w:p>
+        </w:tc>
+        <w:tc>
+          <w:tcPr>
+            <w:tcW w:type="dxa" w:w="1234"/>
+          </w:tcPr>
+          <w:p>
+            <w:r>
+              <w:t>BEYONDRX_OH</w:t>
+            </w:r>
+          </w:p>
+        </w:tc>
+        <w:tc>
+          <w:tcPr>
+            <w:tcW w:type="dxa" w:w="1234"/>
+          </w:tcPr>
+          <w:p>
+            <w:r>
+              <w:t>manual</w:t>
+            </w:r>
+          </w:p>
+        </w:tc>
+        <w:tc>
+          <w:tcPr>
+            <w:tcW w:type="dxa" w:w="1234"/>
+          </w:tcPr>
+          <w:p>
+            <w:r>
+              <w:t>4.14</w:t>
+            </w:r>
+          </w:p>
+        </w:tc>
+        <w:tc>
+          <w:tcPr>
+            <w:tcW w:type="dxa" w:w="1234"/>
+          </w:tcPr>
+          <w:p>
+            <w:r>
+              <w:t>6602</w:t>
+            </w:r>
+          </w:p>
+        </w:tc>
+        <w:tc>
+          <w:tcPr>
+            <w:tcW w:type="dxa" w:w="1234"/>
+          </w:tcPr>
+          <w:p>
+            <w:r>
+              <w:t>492599</w:t>
+            </w:r>
+          </w:p>
+        </w:tc>
+      </w:tr>
+      <w:tr>
+        <w:tc>
+          <w:tcPr>
+            <w:tcW w:type="dxa" w:w="1234"/>
+          </w:tcPr>
+          <w:p>
+            <w:r>
+              <w:t>1</w:t>
+            </w:r>
+          </w:p>
+        </w:tc>
+        <w:tc>
+          <w:tcPr>
+            <w:tcW w:type="dxa" w:w="1234"/>
+          </w:tcPr>
+          <w:p>
+            <w:r>
+              <w:t>Rx</w:t>
+            </w:r>
+          </w:p>
+        </w:tc>
+        <w:tc>
+          <w:tcPr>
+            <w:tcW w:type="dxa" w:w="1234"/>
+          </w:tcPr>
+          <w:p>
+            <w:r>
+              <w:t>BEYONDRX_OH</w:t>
+            </w:r>
+          </w:p>
+        </w:tc>
+        <w:tc>
+          <w:tcPr>
+            <w:tcW w:type="dxa" w:w="1234"/>
+          </w:tcPr>
+          <w:p>
+            <w:r>
+              <w:t>other</w:t>
+            </w:r>
+          </w:p>
+        </w:tc>
+        <w:tc>
+          <w:tcPr>
+            <w:tcW w:type="dxa" w:w="1234"/>
+          </w:tcPr>
+          <w:p>
+            <w:r>
+              <w:t>0.07</w:t>
+            </w:r>
+          </w:p>
+        </w:tc>
+        <w:tc>
+          <w:tcPr>
+            <w:tcW w:type="dxa" w:w="1234"/>
+          </w:tcPr>
+          <w:p>
+            <w:r>
+              <w:t>0</w:t>
+            </w:r>
+          </w:p>
+        </w:tc>
+        <w:tc>
+          <w:tcPr>
+            <w:tcW w:type="dxa" w:w="1234"/>
+          </w:tcPr>
+          <w:p>
+            <w:r>
+              <w:t>8374</w:t>
+            </w:r>
+          </w:p>
+        </w:tc>
+      </w:tr>
+      <w:tr>
+        <w:tc>
+          <w:tcPr>
+            <w:tcW w:type="dxa" w:w="1234"/>
+          </w:tcPr>
+          <w:p>
+            <w:r>
+              <w:t>1</w:t>
+            </w:r>
+          </w:p>
+        </w:tc>
+        <w:tc>
+          <w:tcPr>
+            <w:tcW w:type="dxa" w:w="1234"/>
+          </w:tcPr>
+          <w:p>
+            <w:r>
+              <w:t>Tablet</w:t>
+            </w:r>
+          </w:p>
+        </w:tc>
+        <w:tc>
+          <w:tcPr>
+            <w:tcW w:type="dxa" w:w="1234"/>
+          </w:tcPr>
+          <w:p>
+            <w:r>
+              <w:t>BEYONDRX_AZ</w:t>
+            </w:r>
+          </w:p>
+        </w:tc>
+        <w:tc>
+          <w:tcPr>
+            <w:tcW w:type="dxa" w:w="1234"/>
+          </w:tcPr>
+          <w:p>
+            <w:r>
+              <w:t>automated</w:t>
+            </w:r>
+          </w:p>
+        </w:tc>
+        <w:tc>
+          <w:tcPr>
+            <w:tcW w:type="dxa" w:w="1234"/>
+          </w:tcPr>
+          <w:p>
+            <w:r>
+              <w:t>0.0</w:t>
+            </w:r>
+          </w:p>
+        </w:tc>
+        <w:tc>
+          <w:tcPr>
+            <w:tcW w:type="dxa" w:w="1234"/>
+          </w:tcPr>
+          <w:p>
+            <w:r>
+              <w:t>2</w:t>
+            </w:r>
+          </w:p>
+        </w:tc>
+        <w:tc>
+          <w:tcPr>
+            <w:tcW w:type="dxa" w:w="1234"/>
+          </w:tcPr>
+          <w:p>
+            <w:r>
+              <w:t>90</w:t>
+            </w:r>
+          </w:p>
+        </w:tc>
+      </w:tr>
+      <w:tr>
+        <w:tc>
+          <w:tcPr>
+            <w:tcW w:type="dxa" w:w="1234"/>
+          </w:tcPr>
+          <w:p>
+            <w:r>
+              <w:t>1</w:t>
+            </w:r>
+          </w:p>
+        </w:tc>
+        <w:tc>
+          <w:tcPr>
+            <w:tcW w:type="dxa" w:w="1234"/>
+          </w:tcPr>
+          <w:p>
+            <w:r>
+              <w:t>Tablet</w:t>
+            </w:r>
+          </w:p>
+        </w:tc>
+        <w:tc>
+          <w:tcPr>
+            <w:tcW w:type="dxa" w:w="1234"/>
+          </w:tcPr>
+          <w:p>
+            <w:r>
+              <w:t>BEYONDRX_AZ</w:t>
+            </w:r>
+          </w:p>
+        </w:tc>
+        <w:tc>
+          <w:tcPr>
+            <w:tcW w:type="dxa" w:w="1234"/>
+          </w:tcPr>
+          <w:p>
+            <w:r>
+              <w:t>manual</w:t>
+            </w:r>
+          </w:p>
+        </w:tc>
+        <w:tc>
+          <w:tcPr>
+            <w:tcW w:type="dxa" w:w="1234"/>
+          </w:tcPr>
+          <w:p>
+            <w:r>
+              <w:t>100.0</w:t>
+            </w:r>
+          </w:p>
+        </w:tc>
+        <w:tc>
+          <w:tcPr>
+            <w:tcW w:type="dxa" w:w="1234"/>
+          </w:tcPr>
+          <w:p>
+            <w:r>
+              <w:t>147299</w:t>
+            </w:r>
+          </w:p>
+        </w:tc>
+        <w:tc>
+          <w:tcPr>
+            <w:tcW w:type="dxa" w:w="1234"/>
+          </w:tcPr>
+          <w:p>
+            <w:r>
+              <w:t>15608923</w:t>
+            </w:r>
+          </w:p>
+        </w:tc>
+      </w:tr>
+      <w:tr>
+        <w:tc>
+          <w:tcPr>
+            <w:tcW w:type="dxa" w:w="1234"/>
+          </w:tcPr>
+          <w:p>
+            <w:r>
+              <w:t>1</w:t>
+            </w:r>
+          </w:p>
+        </w:tc>
+        <w:tc>
+          <w:tcPr>
+            <w:tcW w:type="dxa" w:w="1234"/>
+          </w:tcPr>
+          <w:p>
+            <w:r>
+              <w:t>Tablet</w:t>
+            </w:r>
+          </w:p>
+        </w:tc>
+        <w:tc>
+          <w:tcPr>
+            <w:tcW w:type="dxa" w:w="1234"/>
+          </w:tcPr>
+          <w:p>
+            <w:r>
+              <w:t>BEYONDRX_OH</w:t>
+            </w:r>
+          </w:p>
+        </w:tc>
+        <w:tc>
+          <w:tcPr>
+            <w:tcW w:type="dxa" w:w="1234"/>
+          </w:tcPr>
+          <w:p>
+            <w:r>
+              <w:t>automated</w:t>
+            </w:r>
+          </w:p>
+        </w:tc>
+        <w:tc>
+          <w:tcPr>
+            <w:tcW w:type="dxa" w:w="1234"/>
+          </w:tcPr>
+          <w:p>
+            <w:r>
+              <w:t>75.67</w:t>
+            </w:r>
+          </w:p>
+        </w:tc>
+        <w:tc>
+          <w:tcPr>
+            <w:tcW w:type="dxa" w:w="1234"/>
+          </w:tcPr>
+          <w:p>
+            <w:r>
+              <w:t>69507</w:t>
+            </w:r>
+          </w:p>
+        </w:tc>
+        <w:tc>
+          <w:tcPr>
+            <w:tcW w:type="dxa" w:w="1234"/>
+          </w:tcPr>
+          <w:p>
+            <w:r>
+              <w:t>8049750</w:t>
+            </w:r>
+          </w:p>
+        </w:tc>
+      </w:tr>
+      <w:tr>
+        <w:tc>
+          <w:tcPr>
+            <w:tcW w:type="dxa" w:w="1234"/>
+          </w:tcPr>
+          <w:p>
+            <w:r>
+              <w:t>1</w:t>
+            </w:r>
+          </w:p>
+        </w:tc>
+        <w:tc>
+          <w:tcPr>
+            <w:tcW w:type="dxa" w:w="1234"/>
+          </w:tcPr>
+          <w:p>
+            <w:r>
+              <w:t>Tablet</w:t>
+            </w:r>
+          </w:p>
+        </w:tc>
+        <w:tc>
+          <w:tcPr>
+            <w:tcW w:type="dxa" w:w="1234"/>
+          </w:tcPr>
+          <w:p>
+            <w:r>
+              <w:t>BEYONDRX_OH</w:t>
+            </w:r>
+          </w:p>
+        </w:tc>
+        <w:tc>
+          <w:tcPr>
+            <w:tcW w:type="dxa" w:w="1234"/>
+          </w:tcPr>
+          <w:p>
+            <w:r>
+              <w:t>manual</w:t>
+            </w:r>
+          </w:p>
+        </w:tc>
+        <w:tc>
+          <w:tcPr>
+            <w:tcW w:type="dxa" w:w="1234"/>
+          </w:tcPr>
+          <w:p>
+            <w:r>
+              <w:t>24.33</w:t>
+            </w:r>
+          </w:p>
+        </w:tc>
+        <w:tc>
+          <w:tcPr>
+            <w:tcW w:type="dxa" w:w="1234"/>
+          </w:tcPr>
+          <w:p>
+            <w:r>
+              <w:t>26625</w:t>
+            </w:r>
+          </w:p>
+        </w:tc>
+        <w:tc>
+          <w:tcPr>
+            <w:tcW w:type="dxa" w:w="1234"/>
+          </w:tcPr>
+          <w:p>
+            <w:r>
+              <w:t>2588024</w:t>
+            </w:r>
+          </w:p>
+        </w:tc>
+      </w:tr>
+      <w:tr>
+        <w:tc>
+          <w:tcPr>
+            <w:tcW w:type="dxa" w:w="1234"/>
+          </w:tcPr>
+          <w:p>
+            <w:r>
+              <w:t>1</w:t>
+            </w:r>
+          </w:p>
+        </w:tc>
+        <w:tc>
+          <w:tcPr>
+            <w:tcW w:type="dxa" w:w="1234"/>
+          </w:tcPr>
+          <w:p>
+            <w:r>
+              <w:t>Topical</w:t>
+            </w:r>
+          </w:p>
+        </w:tc>
+        <w:tc>
+          <w:tcPr>
+            <w:tcW w:type="dxa" w:w="1234"/>
+          </w:tcPr>
+          <w:p>
+            <w:r>
+              <w:t>BEYONDRX_AZ</w:t>
+            </w:r>
+          </w:p>
+        </w:tc>
+        <w:tc>
+          <w:tcPr>
+            <w:tcW w:type="dxa" w:w="1234"/>
+          </w:tcPr>
+          <w:p>
+            <w:r>
+              <w:t>manual</w:t>
+            </w:r>
+          </w:p>
+        </w:tc>
+        <w:tc>
+          <w:tcPr>
+            <w:tcW w:type="dxa" w:w="1234"/>
+          </w:tcPr>
+          <w:p>
+            <w:r>
+              <w:t>100.0</w:t>
+            </w:r>
+          </w:p>
+        </w:tc>
+        <w:tc>
+          <w:tcPr>
+            <w:tcW w:type="dxa" w:w="1234"/>
+          </w:tcPr>
+          <w:p>
+            <w:r>
+              <w:t>24466</w:t>
+            </w:r>
+          </w:p>
+        </w:tc>
+        <w:tc>
+          <w:tcPr>
+            <w:tcW w:type="dxa" w:w="1234"/>
+          </w:tcPr>
+          <w:p>
+            <w:r>
+              <w:t>4032720</w:t>
+            </w:r>
+          </w:p>
+        </w:tc>
+      </w:tr>
+      <w:tr>
+        <w:tc>
+          <w:tcPr>
+            <w:tcW w:type="dxa" w:w="1234"/>
+          </w:tcPr>
+          <w:p>
+            <w:r>
+              <w:t>1</w:t>
+            </w:r>
+          </w:p>
+        </w:tc>
+        <w:tc>
+          <w:tcPr>
+            <w:tcW w:type="dxa" w:w="1234"/>
+          </w:tcPr>
+          <w:p>
+            <w:r>
+              <w:t>Topical</w:t>
+            </w:r>
+          </w:p>
+        </w:tc>
+        <w:tc>
+          <w:tcPr>
+            <w:tcW w:type="dxa" w:w="1234"/>
+          </w:tcPr>
+          <w:p>
+            <w:r>
+              <w:t>BEYONDRX_OH</w:t>
+            </w:r>
+          </w:p>
+        </w:tc>
+        <w:tc>
+          <w:tcPr>
+            <w:tcW w:type="dxa" w:w="1234"/>
+          </w:tcPr>
+          <w:p>
+            <w:r>
+              <w:t>manual</w:t>
+            </w:r>
+          </w:p>
+        </w:tc>
+        <w:tc>
+          <w:tcPr>
+            <w:tcW w:type="dxa" w:w="1234"/>
+          </w:tcPr>
+          <w:p>
+            <w:r>
+              <w:t>100.0</w:t>
+            </w:r>
+          </w:p>
+        </w:tc>
+        <w:tc>
+          <w:tcPr>
+            <w:tcW w:type="dxa" w:w="1234"/>
+          </w:tcPr>
+          <w:p>
+            <w:r>
+              <w:t>20539</w:t>
+            </w:r>
+          </w:p>
+        </w:tc>
+        <w:tc>
+          <w:tcPr>
+            <w:tcW w:type="dxa" w:w="1234"/>
+          </w:tcPr>
+          <w:p>
+            <w:r>
+              <w:t>3337020</w:t>
+            </w:r>
+          </w:p>
+        </w:tc>
+      </w:tr>
+      <w:tr>
+        <w:tc>
+          <w:tcPr>
+            <w:tcW w:type="dxa" w:w="1234"/>
+          </w:tcPr>
+          <w:p>
+            <w:r>
+              <w:t>2</w:t>
+            </w:r>
+          </w:p>
+        </w:tc>
+        <w:tc>
+          <w:tcPr>
+            <w:tcW w:type="dxa" w:w="1234"/>
+          </w:tcPr>
+          <w:p>
+            <w:r>
+              <w:t>GLP</w:t>
+            </w:r>
+          </w:p>
+        </w:tc>
+        <w:tc>
+          <w:tcPr>
+            <w:tcW w:type="dxa" w:w="1234"/>
+          </w:tcPr>
+          <w:p>
+            <w:r>
+              <w:t>(all)</w:t>
+            </w:r>
+          </w:p>
+        </w:tc>
+        <w:tc>
+          <w:tcPr>
+            <w:tcW w:type="dxa" w:w="1234"/>
+          </w:tcPr>
+          <w:p>
+            <w:r>
+              <w:t>manual</w:t>
+            </w:r>
+          </w:p>
+        </w:tc>
+        <w:tc>
+          <w:tcPr>
+            <w:tcW w:type="dxa" w:w="1234"/>
+          </w:tcPr>
+          <w:p>
+            <w:r>
+              <w:t>100.0</w:t>
+            </w:r>
+          </w:p>
+        </w:tc>
+        <w:tc>
+          <w:tcPr>
+            <w:tcW w:type="dxa" w:w="1234"/>
+          </w:tcPr>
+          <w:p>
+            <w:r>
+              <w:t>9105</w:t>
+            </w:r>
+          </w:p>
+        </w:tc>
+        <w:tc>
+          <w:tcPr>
+            <w:tcW w:type="dxa" w:w="1234"/>
+          </w:tcPr>
+          <w:p>
+            <w:r>
+              <w:t>75970</w:t>
+            </w:r>
+          </w:p>
+        </w:tc>
+      </w:tr>
+      <w:tr>
+        <w:tc>
+          <w:tcPr>
+            <w:tcW w:type="dxa" w:w="1234"/>
+          </w:tcPr>
+          <w:p>
+            <w:r>
+              <w:t>2</w:t>
+            </w:r>
+          </w:p>
+        </w:tc>
+        <w:tc>
+          <w:tcPr>
+            <w:tcW w:type="dxa" w:w="1234"/>
+          </w:tcPr>
+          <w:p>
+            <w:r>
+              <w:t>Gummy</w:t>
+            </w:r>
+          </w:p>
+        </w:tc>
+        <w:tc>
+          <w:tcPr>
+            <w:tcW w:type="dxa" w:w="1234"/>
+          </w:tcPr>
+          <w:p>
+            <w:r>
+              <w:t>(all)</w:t>
+            </w:r>
+          </w:p>
+        </w:tc>
+        <w:tc>
+          <w:tcPr>
+            <w:tcW w:type="dxa" w:w="1234"/>
+          </w:tcPr>
+          <w:p>
+            <w:r>
+              <w:t>manual</w:t>
+            </w:r>
+          </w:p>
+        </w:tc>
+        <w:tc>
+          <w:tcPr>
+            <w:tcW w:type="dxa" w:w="1234"/>
+          </w:tcPr>
+          <w:p>
+            <w:r>
+              <w:t>100.0</w:t>
+            </w:r>
+          </w:p>
+        </w:tc>
+        <w:tc>
+          <w:tcPr>
+            <w:tcW w:type="dxa" w:w="1234"/>
+          </w:tcPr>
+          <w:p>
+            <w:r>
+              <w:t>9940</w:t>
+            </w:r>
+          </w:p>
+        </w:tc>
+        <w:tc>
+          <w:tcPr>
+            <w:tcW w:type="dxa" w:w="1234"/>
+          </w:tcPr>
+          <w:p>
+            <w:r>
+              <w:t>1398420</w:t>
+            </w:r>
+          </w:p>
+        </w:tc>
+      </w:tr>
+      <w:tr>
+        <w:tc>
+          <w:tcPr>
+            <w:tcW w:type="dxa" w:w="1234"/>
+          </w:tcPr>
+          <w:p>
+            <w:r>
+              <w:t>2</w:t>
+            </w:r>
+          </w:p>
+        </w:tc>
+        <w:tc>
+          <w:tcPr>
+            <w:tcW w:type="dxa" w:w="1234"/>
+          </w:tcPr>
+          <w:p>
+            <w:r>
+              <w:t>Meal Kit</w:t>
+            </w:r>
+          </w:p>
+        </w:tc>
+        <w:tc>
+          <w:tcPr>
+            <w:tcW w:type="dxa" w:w="1234"/>
+          </w:tcPr>
+          <w:p>
+            <w:r>
+              <w:t>(all)</w:t>
+            </w:r>
+          </w:p>
+        </w:tc>
+        <w:tc>
+          <w:tcPr>
+            <w:tcW w:type="dxa" w:w="1234"/>
+          </w:tcPr>
+          <w:p>
+            <w:r>
+              <w:t>other</w:t>
+            </w:r>
+          </w:p>
+        </w:tc>
+        <w:tc>
+          <w:tcPr>
+            <w:tcW w:type="dxa" w:w="1234"/>
+          </w:tcPr>
+          <w:p>
+            <w:r>
+              <w:t>100.0</w:t>
+            </w:r>
+          </w:p>
+        </w:tc>
+        <w:tc>
+          <w:tcPr>
+            <w:tcW w:type="dxa" w:w="1234"/>
+          </w:tcPr>
+          <w:p>
+            <w:r>
+              <w:t>0</w:t>
+            </w:r>
+          </w:p>
+        </w:tc>
+        <w:tc>
+          <w:tcPr>
+            <w:tcW w:type="dxa" w:w="1234"/>
+          </w:tcPr>
+          <w:p>
+            <w:r>
+              <w:t>3159</w:t>
+            </w:r>
+          </w:p>
+        </w:tc>
+      </w:tr>
+      <w:tr>
+        <w:tc>
+          <w:tcPr>
+            <w:tcW w:type="dxa" w:w="1234"/>
+          </w:tcPr>
+          <w:p>
+            <w:r>
+              <w:t>2</w:t>
+            </w:r>
+          </w:p>
+        </w:tc>
+        <w:tc>
+          <w:tcPr>
+            <w:tcW w:type="dxa" w:w="1234"/>
+          </w:tcPr>
+          <w:p>
+            <w:r>
+              <w:t>Multis Orders</w:t>
+            </w:r>
+          </w:p>
+        </w:tc>
+        <w:tc>
+          <w:tcPr>
+            <w:tcW w:type="dxa" w:w="1234"/>
+          </w:tcPr>
+          <w:p>
+            <w:r>
+              <w:t>(all)</w:t>
+            </w:r>
+          </w:p>
+        </w:tc>
+        <w:tc>
+          <w:tcPr>
+            <w:tcW w:type="dxa" w:w="1234"/>
+          </w:tcPr>
+          <w:p>
+            <w:r>
+              <w:t>automated</w:t>
+            </w:r>
+          </w:p>
+        </w:tc>
+        <w:tc>
+          <w:tcPr>
+            <w:tcW w:type="dxa" w:w="1234"/>
+          </w:tcPr>
+          <w:p>
+            <w:r>
+              <w:t>69.74</w:t>
+            </w:r>
+          </w:p>
+        </w:tc>
+        <w:tc>
+          <w:tcPr>
+            <w:tcW w:type="dxa" w:w="1234"/>
+          </w:tcPr>
+          <w:p>
+            <w:r>
+              <w:t>58129</w:t>
+            </w:r>
+          </w:p>
+        </w:tc>
+        <w:tc>
+          <w:tcPr>
+            <w:tcW w:type="dxa" w:w="1234"/>
+          </w:tcPr>
+          <w:p>
+            <w:r>
+              <w:t>14114597</w:t>
+            </w:r>
+          </w:p>
+        </w:tc>
+      </w:tr>
+      <w:tr>
+        <w:tc>
+          <w:tcPr>
+            <w:tcW w:type="dxa" w:w="1234"/>
+          </w:tcPr>
+          <w:p>
+            <w:r>
+              <w:t>2</w:t>
+            </w:r>
+          </w:p>
+        </w:tc>
+        <w:tc>
+          <w:tcPr>
+            <w:tcW w:type="dxa" w:w="1234"/>
+          </w:tcPr>
+          <w:p>
+            <w:r>
+              <w:t>Multis Orders</w:t>
+            </w:r>
+          </w:p>
+        </w:tc>
+        <w:tc>
+          <w:tcPr>
+            <w:tcW w:type="dxa" w:w="1234"/>
+          </w:tcPr>
+          <w:p>
+            <w:r>
+              <w:t>(all)</w:t>
+            </w:r>
+          </w:p>
+        </w:tc>
+        <w:tc>
+          <w:tcPr>
+            <w:tcW w:type="dxa" w:w="1234"/>
+          </w:tcPr>
+          <w:p>
+            <w:r>
+              <w:t>manual</w:t>
+            </w:r>
+          </w:p>
+        </w:tc>
+        <w:tc>
+          <w:tcPr>
+            <w:tcW w:type="dxa" w:w="1234"/>
+          </w:tcPr>
+          <w:p>
+            <w:r>
+              <w:t>30.26</w:t>
+            </w:r>
+          </w:p>
+        </w:tc>
+        <w:tc>
+          <w:tcPr>
+            <w:tcW w:type="dxa" w:w="1234"/>
+          </w:tcPr>
+          <w:p>
+            <w:r>
+              <w:t>36000</w:t>
+            </w:r>
+          </w:p>
+        </w:tc>
+        <w:tc>
+          <w:tcPr>
+            <w:tcW w:type="dxa" w:w="1234"/>
+          </w:tcPr>
+          <w:p>
+            <w:r>
+              <w:t>6125620</w:t>
+            </w:r>
+          </w:p>
+        </w:tc>
+      </w:tr>
+      <w:tr>
+        <w:tc>
+          <w:tcPr>
+            <w:tcW w:type="dxa" w:w="1234"/>
+          </w:tcPr>
+          <w:p>
+            <w:r>
+              <w:t>2</w:t>
+            </w:r>
+          </w:p>
+        </w:tc>
+        <w:tc>
+          <w:tcPr>
+            <w:tcW w:type="dxa" w:w="1234"/>
+          </w:tcPr>
+          <w:p>
+            <w:r>
+              <w:t>Non-Rx</w:t>
+            </w:r>
+          </w:p>
+        </w:tc>
+        <w:tc>
+          <w:tcPr>
+            <w:tcW w:type="dxa" w:w="1234"/>
+          </w:tcPr>
+          <w:p>
+            <w:r>
+              <w:t>(all)</w:t>
+            </w:r>
+          </w:p>
+        </w:tc>
+        <w:tc>
+          <w:tcPr>
+            <w:tcW w:type="dxa" w:w="1234"/>
+          </w:tcPr>
+          <w:p>
+            <w:r>
+              <w:t>other</w:t>
+            </w:r>
+          </w:p>
+        </w:tc>
+        <w:tc>
+          <w:tcPr>
+            <w:tcW w:type="dxa" w:w="1234"/>
+          </w:tcPr>
+          <w:p>
+            <w:r>
+              <w:t>100.0</w:t>
+            </w:r>
+          </w:p>
+        </w:tc>
+        <w:tc>
+          <w:tcPr>
+            <w:tcW w:type="dxa" w:w="1234"/>
+          </w:tcPr>
+          <w:p>
+            <w:r>
+              <w:t>0</w:t>
+            </w:r>
+          </w:p>
+        </w:tc>
+        <w:tc>
+          <w:tcPr>
+            <w:tcW w:type="dxa" w:w="1234"/>
+          </w:tcPr>
+          <w:p>
+            <w:r>
+              <w:t>78717</w:t>
+            </w:r>
+          </w:p>
+        </w:tc>
+      </w:tr>
+      <w:tr>
+        <w:tc>
+          <w:tcPr>
+            <w:tcW w:type="dxa" w:w="1234"/>
+          </w:tcPr>
+          <w:p>
+            <w:r>
+              <w:t>2</w:t>
+            </w:r>
+          </w:p>
+        </w:tc>
+        <w:tc>
+          <w:tcPr>
+            <w:tcW w:type="dxa" w:w="1234"/>
+          </w:tcPr>
+          <w:p>
+            <w:r>
+              <w:t>Rx</w:t>
+            </w:r>
+          </w:p>
+        </w:tc>
+        <w:tc>
+          <w:tcPr>
+            <w:tcW w:type="dxa" w:w="1234"/>
+          </w:tcPr>
+          <w:p>
+            <w:r>
+              <w:t>(all)</w:t>
+            </w:r>
+          </w:p>
+        </w:tc>
+        <w:tc>
+          <w:tcPr>
+            <w:tcW w:type="dxa" w:w="1234"/>
+          </w:tcPr>
+          <w:p>
+            <w:r>
+              <w:t>automated</w:t>
+            </w:r>
+          </w:p>
+        </w:tc>
+        <w:tc>
+          <w:tcPr>
+            <w:tcW w:type="dxa" w:w="1234"/>
+          </w:tcPr>
+          <w:p>
+            <w:r>
+              <w:t>91.52</w:t>
+            </w:r>
+          </w:p>
+        </w:tc>
+        <w:tc>
+          <w:tcPr>
+            <w:tcW w:type="dxa" w:w="1234"/>
+          </w:tcPr>
+          <w:p>
+            <w:r>
+              <w:t>261627</w:t>
+            </w:r>
+          </w:p>
+        </w:tc>
+        <w:tc>
+          <w:tcPr>
+            <w:tcW w:type="dxa" w:w="1234"/>
+          </w:tcPr>
+          <w:p>
+            <w:r>
+              <w:t>16786462</w:t>
+            </w:r>
+          </w:p>
+        </w:tc>
+      </w:tr>
+      <w:tr>
+        <w:tc>
+          <w:tcPr>
+            <w:tcW w:type="dxa" w:w="1234"/>
+          </w:tcPr>
+          <w:p>
+            <w:r>
+              <w:t>2</w:t>
+            </w:r>
+          </w:p>
+        </w:tc>
+        <w:tc>
+          <w:tcPr>
+            <w:tcW w:type="dxa" w:w="1234"/>
+          </w:tcPr>
+          <w:p>
+            <w:r>
+              <w:t>Rx</w:t>
+            </w:r>
+          </w:p>
+        </w:tc>
+        <w:tc>
+          <w:tcPr>
+            <w:tcW w:type="dxa" w:w="1234"/>
+          </w:tcPr>
+          <w:p>
+            <w:r>
+              <w:t>(all)</w:t>
+            </w:r>
+          </w:p>
+        </w:tc>
+        <w:tc>
+          <w:tcPr>
+            <w:tcW w:type="dxa" w:w="1234"/>
+          </w:tcPr>
+          <w:p>
+            <w:r>
+              <w:t>manual</w:t>
+            </w:r>
+          </w:p>
+        </w:tc>
+        <w:tc>
+          <w:tcPr>
+            <w:tcW w:type="dxa" w:w="1234"/>
+          </w:tcPr>
+          <w:p>
+            <w:r>
+              <w:t>8.4</w:t>
+            </w:r>
+          </w:p>
+        </w:tc>
+        <w:tc>
+          <w:tcPr>
+            <w:tcW w:type="dxa" w:w="1234"/>
+          </w:tcPr>
+          <w:p>
+            <w:r>
+              <w:t>18830</w:t>
+            </w:r>
+          </w:p>
+        </w:tc>
+        <w:tc>
+          <w:tcPr>
+            <w:tcW w:type="dxa" w:w="1234"/>
+          </w:tcPr>
+          <w:p>
+            <w:r>
+              <w:t>1541224</w:t>
+            </w:r>
+          </w:p>
+        </w:tc>
+      </w:tr>
+      <w:tr>
+        <w:tc>
+          <w:tcPr>
+            <w:tcW w:type="dxa" w:w="1234"/>
+          </w:tcPr>
+          <w:p>
+            <w:r>
+              <w:t>2</w:t>
+            </w:r>
+          </w:p>
+        </w:tc>
+        <w:tc>
+          <w:tcPr>
+            <w:tcW w:type="dxa" w:w="1234"/>
+          </w:tcPr>
+          <w:p>
+            <w:r>
+              <w:t>Rx</w:t>
+            </w:r>
+          </w:p>
+        </w:tc>
+        <w:tc>
+          <w:tcPr>
+            <w:tcW w:type="dxa" w:w="1234"/>
+          </w:tcPr>
+          <w:p>
+            <w:r>
+              <w:t>(all)</w:t>
+            </w:r>
+          </w:p>
+        </w:tc>
+        <w:tc>
+          <w:tcPr>
+            <w:tcW w:type="dxa" w:w="1234"/>
+          </w:tcPr>
+          <w:p>
+            <w:r>
+              <w:t>other</w:t>
+            </w:r>
+          </w:p>
+        </w:tc>
+        <w:tc>
+          <w:tcPr>
+            <w:tcW w:type="dxa" w:w="1234"/>
+          </w:tcPr>
+          <w:p>
+            <w:r>
+              <w:t>0.07</w:t>
+            </w:r>
+          </w:p>
+        </w:tc>
+        <w:tc>
+          <w:tcPr>
+            <w:tcW w:type="dxa" w:w="1234"/>
+          </w:tcPr>
+          <w:p>
+            <w:r>
+              <w:t>0</w:t>
+            </w:r>
+          </w:p>
+        </w:tc>
+        <w:tc>
+          <w:tcPr>
+            <w:tcW w:type="dxa" w:w="1234"/>
+          </w:tcPr>
+          <w:p>
+            <w:r>
+              <w:t>13555</w:t>
+            </w:r>
+          </w:p>
+        </w:tc>
+      </w:tr>
+      <w:tr>
+        <w:tc>
+          <w:tcPr>
+            <w:tcW w:type="dxa" w:w="1234"/>
+          </w:tcPr>
+          <w:p>
+            <w:r>
+              <w:t>2</w:t>
+            </w:r>
+          </w:p>
+        </w:tc>
+        <w:tc>
+          <w:tcPr>
+            <w:tcW w:type="dxa" w:w="1234"/>
+          </w:tcPr>
+          <w:p>
+            <w:r>
+              <w:t>Tablet</w:t>
+            </w:r>
+          </w:p>
+        </w:tc>
+        <w:tc>
+          <w:tcPr>
+            <w:tcW w:type="dxa" w:w="1234"/>
+          </w:tcPr>
+          <w:p>
+            <w:r>
+              <w:t>(all)</w:t>
+            </w:r>
+          </w:p>
+        </w:tc>
+        <w:tc>
+          <w:tcPr>
+            <w:tcW w:type="dxa" w:w="1234"/>
+          </w:tcPr>
+          <w:p>
+            <w:r>
+              <w:t>automated</w:t>
+            </w:r>
+          </w:p>
+        </w:tc>
+        <w:tc>
+          <w:tcPr>
+            <w:tcW w:type="dxa" w:w="1234"/>
+          </w:tcPr>
+          <w:p>
+            <w:r>
+              <w:t>30.67</w:t>
+            </w:r>
+          </w:p>
+        </w:tc>
+        <w:tc>
+          <w:tcPr>
+            <w:tcW w:type="dxa" w:w="1234"/>
+          </w:tcPr>
+          <w:p>
+            <w:r>
+              <w:t>69509</w:t>
+            </w:r>
+          </w:p>
+        </w:tc>
+        <w:tc>
+          <w:tcPr>
+            <w:tcW w:type="dxa" w:w="1234"/>
+          </w:tcPr>
+          <w:p>
+            <w:r>
+              <w:t>8049840</w:t>
+            </w:r>
+          </w:p>
+        </w:tc>
+      </w:tr>
+      <w:tr>
+        <w:tc>
+          <w:tcPr>
+            <w:tcW w:type="dxa" w:w="1234"/>
+          </w:tcPr>
+          <w:p>
+            <w:r>
+              <w:t>2</w:t>
+            </w:r>
+          </w:p>
+        </w:tc>
+        <w:tc>
+          <w:tcPr>
+            <w:tcW w:type="dxa" w:w="1234"/>
+          </w:tcPr>
+          <w:p>
+            <w:r>
+              <w:t>Tablet</w:t>
+            </w:r>
+          </w:p>
+        </w:tc>
+        <w:tc>
+          <w:tcPr>
+            <w:tcW w:type="dxa" w:w="1234"/>
+          </w:tcPr>
+          <w:p>
+            <w:r>
+              <w:t>(all)</w:t>
+            </w:r>
+          </w:p>
+        </w:tc>
+        <w:tc>
+          <w:tcPr>
+            <w:tcW w:type="dxa" w:w="1234"/>
+          </w:tcPr>
+          <w:p>
+            <w:r>
+              <w:t>manual</w:t>
+            </w:r>
+          </w:p>
+        </w:tc>
+        <w:tc>
+          <w:tcPr>
+            <w:tcW w:type="dxa" w:w="1234"/>
+          </w:tcPr>
+          <w:p>
+            <w:r>
+              <w:t>69.33</w:t>
+            </w:r>
+          </w:p>
+        </w:tc>
+        <w:tc>
+          <w:tcPr>
+            <w:tcW w:type="dxa" w:w="1234"/>
+          </w:tcPr>
+          <w:p>
+            <w:r>
+              <w:t>173924</w:t>
+            </w:r>
+          </w:p>
+        </w:tc>
+        <w:tc>
+          <w:tcPr>
+            <w:tcW w:type="dxa" w:w="1234"/>
+          </w:tcPr>
+          <w:p>
+            <w:r>
+              <w:t>18196947</w:t>
+            </w:r>
+          </w:p>
+        </w:tc>
+      </w:tr>
+      <w:tr>
+        <w:tc>
+          <w:tcPr>
+            <w:tcW w:type="dxa" w:w="1234"/>
+          </w:tcPr>
+          <w:p>
+            <w:r>
+              <w:t>2</w:t>
+            </w:r>
+          </w:p>
+        </w:tc>
+        <w:tc>
+          <w:tcPr>
+            <w:tcW w:type="dxa" w:w="1234"/>
+          </w:tcPr>
+          <w:p>
+            <w:r>
+              <w:t>Topical</w:t>
+            </w:r>
+          </w:p>
+        </w:tc>
+        <w:tc>
+          <w:tcPr>
+            <w:tcW w:type="dxa" w:w="1234"/>
+          </w:tcPr>
+          <w:p>
+            <w:r>
+              <w:t>(all)</w:t>
+            </w:r>
+          </w:p>
+        </w:tc>
+        <w:tc>
+          <w:tcPr>
+            <w:tcW w:type="dxa" w:w="1234"/>
+          </w:tcPr>
+          <w:p>
+            <w:r>
+              <w:t>manual</w:t>
+            </w:r>
+          </w:p>
+        </w:tc>
+        <w:tc>
+          <w:tcPr>
+            <w:tcW w:type="dxa" w:w="1234"/>
+          </w:tcPr>
+          <w:p>
+            <w:r>
+              <w:t>100.0</w:t>
+            </w:r>
+          </w:p>
+        </w:tc>
+        <w:tc>
+          <w:tcPr>
+            <w:tcW w:type="dxa" w:w="1234"/>
+          </w:tcPr>
+          <w:p>
+            <w:r>
+              <w:t>45005</w:t>
+            </w:r>
+          </w:p>
+        </w:tc>
+        <w:tc>
+          <w:tcPr>
+            <w:tcW w:type="dxa" w:w="1234"/>
+          </w:tcPr>
+          <w:p>
+            <w:r>
+              <w:t>7369740</w:t>
+            </w:r>
+          </w:p>
+        </w:tc>
+      </w:tr>
+      <w:tr>
+        <w:tc>
+          <w:tcPr>
+            <w:tcW w:type="dxa" w:w="1234"/>
+          </w:tcPr>
+          <w:p>
+            <w:r>
+              <w:t>3</w:t>
+            </w:r>
+          </w:p>
+        </w:tc>
+        <w:tc>
+          <w:tcPr>
+            <w:tcW w:type="dxa" w:w="1234"/>
+          </w:tcPr>
+          <w:p>
+            <w:r>
+              <w:t>(all)</w:t>
+            </w:r>
+          </w:p>
+        </w:tc>
+        <w:tc>
+          <w:tcPr>
+            <w:tcW w:type="dxa" w:w="1234"/>
+          </w:tcPr>
+          <w:p>
+            <w:r>
+              <w:t>BEYONDRX_AZ</w:t>
+            </w:r>
+          </w:p>
+        </w:tc>
+        <w:tc>
+          <w:tcPr>
+            <w:tcW w:type="dxa" w:w="1234"/>
+          </w:tcPr>
+          <w:p>
+            <w:r>
+              <w:t>automated</w:t>
+            </w:r>
+          </w:p>
+        </w:tc>
+        <w:tc>
+          <w:tcPr>
+            <w:tcW w:type="dxa" w:w="1234"/>
+          </w:tcPr>
+          <w:p>
+            <w:r>
+              <w:t>24.05</w:t>
+            </w:r>
+          </w:p>
+        </w:tc>
+        <w:tc>
+          <w:tcPr>
+            <w:tcW w:type="dxa" w:w="1234"/>
+          </w:tcPr>
+          <w:p>
+            <w:r>
+              <w:t>99510</w:t>
+            </w:r>
+          </w:p>
+        </w:tc>
+        <w:tc>
+          <w:tcPr>
+            <w:tcW w:type="dxa" w:w="1234"/>
+          </w:tcPr>
+          <w:p>
+            <w:r>
+              <w:t>8224605</w:t>
+            </w:r>
+          </w:p>
+        </w:tc>
+      </w:tr>
+      <w:tr>
+        <w:tc>
+          <w:tcPr>
+            <w:tcW w:type="dxa" w:w="1234"/>
+          </w:tcPr>
+          <w:p>
+            <w:r>
+              <w:t>3</w:t>
+            </w:r>
+          </w:p>
+        </w:tc>
+        <w:tc>
+          <w:tcPr>
+            <w:tcW w:type="dxa" w:w="1234"/>
+          </w:tcPr>
+          <w:p>
+            <w:r>
+              <w:t>(all)</w:t>
+            </w:r>
+          </w:p>
+        </w:tc>
+        <w:tc>
+          <w:tcPr>
+            <w:tcW w:type="dxa" w:w="1234"/>
+          </w:tcPr>
+          <w:p>
+            <w:r>
+              <w:t>BEYONDRX_AZ</w:t>
+            </w:r>
+          </w:p>
+        </w:tc>
+        <w:tc>
+          <w:tcPr>
+            <w:tcW w:type="dxa" w:w="1234"/>
+          </w:tcPr>
+          <w:p>
+            <w:r>
+              <w:t>manual</w:t>
+            </w:r>
+          </w:p>
+        </w:tc>
+        <w:tc>
+          <w:tcPr>
+            <w:tcW w:type="dxa" w:w="1234"/>
+          </w:tcPr>
+          <w:p>
+            <w:r>
+              <w:t>75.93</w:t>
+            </w:r>
+          </w:p>
+        </w:tc>
+        <w:tc>
+          <w:tcPr>
+            <w:tcW w:type="dxa" w:w="1234"/>
+          </w:tcPr>
+          <w:p>
+            <w:r>
+              <w:t>211113</w:t>
+            </w:r>
+          </w:p>
+        </w:tc>
+        <w:tc>
+          <w:tcPr>
+            <w:tcW w:type="dxa" w:w="1234"/>
+          </w:tcPr>
+          <w:p>
+            <w:r>
+              <w:t>25962028</w:t>
+            </w:r>
+          </w:p>
+        </w:tc>
+      </w:tr>
+      <w:tr>
+        <w:tc>
+          <w:tcPr>
+            <w:tcW w:type="dxa" w:w="1234"/>
+          </w:tcPr>
+          <w:p>
+            <w:r>
+              <w:t>3</w:t>
+            </w:r>
+          </w:p>
+        </w:tc>
+        <w:tc>
+          <w:tcPr>
+            <w:tcW w:type="dxa" w:w="1234"/>
+          </w:tcPr>
+          <w:p>
+            <w:r>
+              <w:t>(all)</w:t>
+            </w:r>
+          </w:p>
+        </w:tc>
+        <w:tc>
+          <w:tcPr>
+            <w:tcW w:type="dxa" w:w="1234"/>
+          </w:tcPr>
+          <w:p>
+            <w:r>
+              <w:t>BEYONDRX_AZ</w:t>
+            </w:r>
+          </w:p>
+        </w:tc>
+        <w:tc>
+          <w:tcPr>
+            <w:tcW w:type="dxa" w:w="1234"/>
+          </w:tcPr>
+          <w:p>
+            <w:r>
+              <w:t>other</w:t>
+            </w:r>
+          </w:p>
+        </w:tc>
+        <w:tc>
+          <w:tcPr>
+            <w:tcW w:type="dxa" w:w="1234"/>
+          </w:tcPr>
+          <w:p>
+            <w:r>
+              <w:t>0.02</w:t>
+            </w:r>
+          </w:p>
+        </w:tc>
+        <w:tc>
+          <w:tcPr>
+            <w:tcW w:type="dxa" w:w="1234"/>
+          </w:tcPr>
+          <w:p>
+            <w:r>
+              <w:t>0</w:t>
+            </w:r>
+          </w:p>
+        </w:tc>
+        <w:tc>
+          <w:tcPr>
+            <w:tcW w:type="dxa" w:w="1234"/>
+          </w:tcPr>
+          <w:p>
+            <w:r>
+              <w:t>5181</w:t>
+            </w:r>
+          </w:p>
+        </w:tc>
+      </w:tr>
+      <w:tr>
+        <w:tc>
+          <w:tcPr>
+            <w:tcW w:type="dxa" w:w="1234"/>
+          </w:tcPr>
+          <w:p>
+            <w:r>
+              <w:t>3</w:t>
+            </w:r>
+          </w:p>
+        </w:tc>
+        <w:tc>
+          <w:tcPr>
+            <w:tcW w:type="dxa" w:w="1234"/>
+          </w:tcPr>
+          <w:p>
+            <w:r>
+              <w:t>(all)</w:t>
+            </w:r>
+          </w:p>
+        </w:tc>
+        <w:tc>
+          <w:tcPr>
+            <w:tcW w:type="dxa" w:w="1234"/>
+          </w:tcPr>
+          <w:p>
+            <w:r>
+              <w:t>BEYONDRX_OH</w:t>
+            </w:r>
+          </w:p>
+        </w:tc>
+        <w:tc>
+          <w:tcPr>
+            <w:tcW w:type="dxa" w:w="1234"/>
+          </w:tcPr>
+          <w:p>
+            <w:r>
+              <w:t>automated</w:t>
+            </w:r>
+          </w:p>
+        </w:tc>
+        <w:tc>
+          <w:tcPr>
+            <w:tcW w:type="dxa" w:w="1234"/>
+          </w:tcPr>
+          <w:p>
+            <w:r>
+              <w:t>77.83</w:t>
+            </w:r>
+          </w:p>
+        </w:tc>
+        <w:tc>
+          <w:tcPr>
+            <w:tcW w:type="dxa" w:w="1234"/>
+          </w:tcPr>
+          <w:p>
+            <w:r>
+              <w:t>289755</w:t>
+            </w:r>
+          </w:p>
+        </w:tc>
+        <w:tc>
+          <w:tcPr>
+            <w:tcW w:type="dxa" w:w="1234"/>
+          </w:tcPr>
+          <w:p>
+            <w:r>
+              <w:t>30726294</w:t>
+            </w:r>
+          </w:p>
+        </w:tc>
+      </w:tr>
+      <w:tr>
+        <w:tc>
+          <w:tcPr>
+            <w:tcW w:type="dxa" w:w="1234"/>
+          </w:tcPr>
+          <w:p>
+            <w:r>
+              <w:t>3</w:t>
+            </w:r>
+          </w:p>
+        </w:tc>
+        <w:tc>
+          <w:tcPr>
+            <w:tcW w:type="dxa" w:w="1234"/>
+          </w:tcPr>
+          <w:p>
+            <w:r>
+              <w:t>(all)</w:t>
+            </w:r>
+          </w:p>
+        </w:tc>
+        <w:tc>
+          <w:tcPr>
+            <w:tcW w:type="dxa" w:w="1234"/>
+          </w:tcPr>
+          <w:p>
+            <w:r>
+              <w:t>BEYONDRX_OH</w:t>
+            </w:r>
+          </w:p>
+        </w:tc>
+        <w:tc>
+          <w:tcPr>
+            <w:tcW w:type="dxa" w:w="1234"/>
+          </w:tcPr>
+          <w:p>
+            <w:r>
+              <w:t>manual</w:t>
+            </w:r>
+          </w:p>
+        </w:tc>
+        <w:tc>
+          <w:tcPr>
+            <w:tcW w:type="dxa" w:w="1234"/>
+          </w:tcPr>
+          <w:p>
+            <w:r>
+              <w:t>22.15</w:t>
+            </w:r>
+          </w:p>
+        </w:tc>
+        <w:tc>
+          <w:tcPr>
+            <w:tcW w:type="dxa" w:w="1234"/>
+          </w:tcPr>
+          <w:p>
+            <w:r>
+              <w:t>81691</w:t>
+            </w:r>
+          </w:p>
+        </w:tc>
+        <w:tc>
+          <w:tcPr>
+            <w:tcW w:type="dxa" w:w="1234"/>
+          </w:tcPr>
+          <w:p>
+            <w:r>
+              <w:t>8745893</w:t>
+            </w:r>
+          </w:p>
+        </w:tc>
+      </w:tr>
+      <w:tr>
+        <w:tc>
+          <w:tcPr>
+            <w:tcW w:type="dxa" w:w="1234"/>
+          </w:tcPr>
+          <w:p>
+            <w:r>
+              <w:t>3</w:t>
+            </w:r>
+          </w:p>
+        </w:tc>
+        <w:tc>
+          <w:tcPr>
+            <w:tcW w:type="dxa" w:w="1234"/>
+          </w:tcPr>
+          <w:p>
+            <w:r>
+              <w:t>(all)</w:t>
+            </w:r>
+          </w:p>
+        </w:tc>
+        <w:tc>
+          <w:tcPr>
+            <w:tcW w:type="dxa" w:w="1234"/>
+          </w:tcPr>
+          <w:p>
+            <w:r>
+              <w:t>BEYONDRX_OH</w:t>
+            </w:r>
+          </w:p>
+        </w:tc>
+        <w:tc>
+          <w:tcPr>
+            <w:tcW w:type="dxa" w:w="1234"/>
+          </w:tcPr>
+          <w:p>
+            <w:r>
+              <w:t>other</w:t>
+            </w:r>
+          </w:p>
+        </w:tc>
+        <w:tc>
+          <w:tcPr>
+            <w:tcW w:type="dxa" w:w="1234"/>
+          </w:tcPr>
+          <w:p>
+            <w:r>
+              <w:t>0.02</w:t>
+            </w:r>
+          </w:p>
+        </w:tc>
+        <w:tc>
+          <w:tcPr>
+            <w:tcW w:type="dxa" w:w="1234"/>
+          </w:tcPr>
+          <w:p>
+            <w:r>
+              <w:t>0</w:t>
+            </w:r>
+          </w:p>
+        </w:tc>
+        <w:tc>
+          <w:tcPr>
+            <w:tcW w:type="dxa" w:w="1234"/>
+          </w:tcPr>
+          <w:p>
+            <w:r>
+              <w:t>8374</w:t>
+            </w:r>
+          </w:p>
+        </w:tc>
+      </w:tr>
+      <w:tr>
+        <w:tc>
+          <w:tcPr>
+            <w:tcW w:type="dxa" w:w="1234"/>
+          </w:tcPr>
+          <w:p>
+            <w:r>
+              <w:t>3</w:t>
+            </w:r>
+          </w:p>
+        </w:tc>
+        <w:tc>
+          <w:tcPr>
+            <w:tcW w:type="dxa" w:w="1234"/>
+          </w:tcPr>
+          <w:p>
+            <w:r>
+              <w:t>(all)</w:t>
+            </w:r>
+          </w:p>
+        </w:tc>
+        <w:tc>
+          <w:tcPr>
+            <w:tcW w:type="dxa" w:w="1234"/>
+          </w:tcPr>
+          <w:p>
+            <w:r>
+              <w:t>OHIO</w:t>
+            </w:r>
+          </w:p>
+        </w:tc>
+        <w:tc>
+          <w:tcPr>
+            <w:tcW w:type="dxa" w:w="1234"/>
+          </w:tcPr>
+          <w:p>
+            <w:r>
+              <w:t>other</w:t>
+            </w:r>
+          </w:p>
+        </w:tc>
+        <w:tc>
+          <w:tcPr>
+            <w:tcW w:type="dxa" w:w="1234"/>
+          </w:tcPr>
+          <w:p>
+            <w:r>
+              <w:t>100.0</w:t>
+            </w:r>
+          </w:p>
+        </w:tc>
+        <w:tc>
+          <w:tcPr>
+            <w:tcW w:type="dxa" w:w="1234"/>
+          </w:tcPr>
+          <w:p>
+            <w:r>
+              <w:t>0</w:t>
+            </w:r>
+          </w:p>
+        </w:tc>
+        <w:tc>
+          <w:tcPr>
+            <w:tcW w:type="dxa" w:w="1234"/>
+          </w:tcPr>
+          <w:p>
+            <w:r>
+              <w:t>81876</w:t>
+            </w:r>
+          </w:p>
+        </w:tc>
+      </w:tr>
+      <w:tr>
+        <w:tc>
+          <w:tcPr>
+            <w:tcW w:type="dxa" w:w="1234"/>
+          </w:tcPr>
+          <w:p>
+            <w:r>
+              <w:t>4</w:t>
+            </w:r>
+          </w:p>
+        </w:tc>
+        <w:tc>
+          <w:tcPr>
+            <w:tcW w:type="dxa" w:w="1234"/>
+          </w:tcPr>
+          <w:p>
+            <w:r>
+              <w:t>(all)</w:t>
+            </w:r>
+          </w:p>
+        </w:tc>
+        <w:tc>
+          <w:tcPr>
+            <w:tcW w:type="dxa" w:w="1234"/>
+          </w:tcPr>
+          <w:p>
+            <w:r>
+              <w:t>(all)</w:t>
+            </w:r>
+          </w:p>
+        </w:tc>
+        <w:tc>
+          <w:tcPr>
+            <w:tcW w:type="dxa" w:w="1234"/>
+          </w:tcPr>
+          <w:p>
+            <w:r>
+              <w:t>automated</w:t>
+            </w:r>
+          </w:p>
+        </w:tc>
+        <w:tc>
+          <w:tcPr>
+            <w:tcW w:type="dxa" w:w="1234"/>
+          </w:tcPr>
+          <w:p>
+            <w:r>
+              <w:t>52.81</w:t>
+            </w:r>
+          </w:p>
+        </w:tc>
+        <w:tc>
+          <w:tcPr>
+            <w:tcW w:type="dxa" w:w="1234"/>
+          </w:tcPr>
+          <w:p>
+            <w:r>
+              <w:t>389265</w:t>
+            </w:r>
+          </w:p>
+        </w:tc>
+        <w:tc>
+          <w:tcPr>
+            <w:tcW w:type="dxa" w:w="1234"/>
+          </w:tcPr>
+          <w:p>
+            <w:r>
+              <w:t>38950899</w:t>
+            </w:r>
+          </w:p>
+        </w:tc>
+      </w:tr>
+      <w:tr>
+        <w:tc>
+          <w:tcPr>
+            <w:tcW w:type="dxa" w:w="1234"/>
+          </w:tcPr>
+          <w:p>
+            <w:r>
+              <w:t>4</w:t>
+            </w:r>
+          </w:p>
+        </w:tc>
+        <w:tc>
+          <w:tcPr>
+            <w:tcW w:type="dxa" w:w="1234"/>
+          </w:tcPr>
+          <w:p>
+            <w:r>
+              <w:t>(all)</w:t>
+            </w:r>
+          </w:p>
+        </w:tc>
+        <w:tc>
+          <w:tcPr>
+            <w:tcW w:type="dxa" w:w="1234"/>
+          </w:tcPr>
+          <w:p>
+            <w:r>
+              <w:t>(all)</w:t>
+            </w:r>
+          </w:p>
+        </w:tc>
+        <w:tc>
+          <w:tcPr>
+            <w:tcW w:type="dxa" w:w="1234"/>
+          </w:tcPr>
+          <w:p>
+            <w:r>
+              <w:t>manual</w:t>
+            </w:r>
+          </w:p>
+        </w:tc>
+        <w:tc>
+          <w:tcPr>
+            <w:tcW w:type="dxa" w:w="1234"/>
+          </w:tcPr>
+          <w:p>
+            <w:r>
+              <w:t>47.06</w:t>
+            </w:r>
+          </w:p>
+        </w:tc>
+        <w:tc>
+          <w:tcPr>
+            <w:tcW w:type="dxa" w:w="1234"/>
+          </w:tcPr>
+          <w:p>
+            <w:r>
+              <w:t>292804</w:t>
+            </w:r>
+          </w:p>
+        </w:tc>
+        <w:tc>
+          <w:tcPr>
+            <w:tcW w:type="dxa" w:w="1234"/>
+          </w:tcPr>
+          <w:p>
+            <w:r>
+              <w:t>34707921</w:t>
+            </w:r>
+          </w:p>
+        </w:tc>
+      </w:tr>
+      <w:tr>
+        <w:tc>
+          <w:tcPr>
+            <w:tcW w:type="dxa" w:w="1234"/>
+          </w:tcPr>
+          <w:p>
+            <w:r>
+              <w:t>4</w:t>
+            </w:r>
+          </w:p>
+        </w:tc>
+        <w:tc>
+          <w:tcPr>
+            <w:tcW w:type="dxa" w:w="1234"/>
+          </w:tcPr>
+          <w:p>
+            <w:r>
+              <w:t>(all)</w:t>
+            </w:r>
+          </w:p>
+        </w:tc>
+        <w:tc>
+          <w:tcPr>
+            <w:tcW w:type="dxa" w:w="1234"/>
+          </w:tcPr>
+          <w:p>
+            <w:r>
+              <w:t>(all)</w:t>
+            </w:r>
+          </w:p>
+        </w:tc>
+        <w:tc>
+          <w:tcPr>
+            <w:tcW w:type="dxa" w:w="1234"/>
+          </w:tcPr>
+          <w:p>
+            <w:r>
+              <w:t>other</w:t>
+            </w:r>
+          </w:p>
+        </w:tc>
+        <w:tc>
+          <w:tcPr>
+            <w:tcW w:type="dxa" w:w="1234"/>
+          </w:tcPr>
+          <w:p>
+            <w:r>
+              <w:t>0.13</w:t>
+            </w:r>
+          </w:p>
+        </w:tc>
+        <w:tc>
+          <w:tcPr>
+            <w:tcW w:type="dxa" w:w="1234"/>
+          </w:tcPr>
+          <w:p>
+            <w:r>
+              <w:t>0</w:t>
+            </w:r>
+          </w:p>
+        </w:tc>
+        <w:tc>
+          <w:tcPr>
+            <w:tcW w:type="dxa" w:w="1234"/>
+          </w:tcPr>
+          <w:p>
+            <w:r>
+              <w:t>95431</w:t>
+            </w:r>
+          </w:p>
+        </w:tc>
+      </w:tr>
+    </w:tbl>
+    <w:p/>
+    <w:p>
+      <w:r>
+        <w:t>See RATIO_APPLICATION.md for full usage.</w:t>
+      </w:r>
+    </w:p>
+    <w:p>
+      <w:pPr>
+        <w:pStyle w:val="Heading1"/>
+      </w:pPr>
+      <w:r>
+        <w:t>5. Next Steps</w:t>
+      </w:r>
+    </w:p>
+    <w:p>
+      <w:r>
+        <w:t>• Apply dispense_ratio_lookup.csv to forecast volume (product_type × wh_name)</w:t>
         <w:br/>
-        <w:t>• Implement Phase 1 lookup + rules for known (product_id, wh_name) pairs</w:t>
+        <w:t>• Refresh ratios monthly/quarterly by re-running the analysis pipeline</w:t>
         <w:br/>
-        <w:t>• Optional: Build ML model (logistic or tree) using selected features</w:t>
+        <w:t>• Use level 1 ratios first; fall back to level 2/3/4 when forecast lacks dimensions</w:t>
       </w:r>
     </w:p>
     <w:sectPr>

</xml_diff>